<commit_message>
Revisao final TR: coerencia de conteudo
- Tabela individualizados: colapsa duplicata Penha (Penha I e II) -> 18 linhas-plano
- Renomeia 2o 'Base Operacional Penha' -> 'Penha II' no mapa (geojson+gpkg)
- Sec.93: agrupados cobrem 'demais unidades (geradoras menores e nao geradoras)', criterio = maior geracao
- Sec.128: capacitacao '(19 municipios)' -> '(22 municipios com geradoras)' (numero antigo)
- Verificado: somatorios 179, sem 53/regional/Tabela 6 residuais

Co-Authored-By: Claude Opus 4.8 <noreply@anthropic.com>
Claude-Session: https://claude.ai/code/session_01RiBxk7VWFWAPqjYN9jBWji
</commit_message>
<xml_diff>
--- a/TR_PGRS_AguasDoRio_Rev04.docx
+++ b/TR_PGRS_AguasDoRio_Rev04.docx
@@ -3380,7 +3380,7 @@
           <w:sz w:val="24"/>
           <w:szCs w:val="24"/>
         </w:rPr>
-        <w:t xml:space="preserve">Este documento fixa os requisitos e diretrizes para a contratação de todos os serviços necessários à total e completa elaboração dos Planos de Gerenciamento de Resíduos Sólidos (PGRS) no âmbito das unidades operacionais sob responsabilidade da Concessionária Águas do Rio, no Estado do Rio de Janeiro, priorizando as unidades efetivamente geradoras de resíduos. Diferentemente do contrato anterior — no qual os PGRS foram elaborados de maneira agregada, contemplando grupos de municípios e seus ativos correspondentes —, o presente escopo adota PGRS individualizados para as unidades de maior relevância e PGRS agrupados por proximidade geográfica para as demais geradoras. A proposta integrará o respectivo Contrato como anexo, constituindo compromisso de execução integral do serviço.</w:t>
+        <w:t>Este documento fixa os requisitos e diretrizes para a contratação de todos os serviços necessários à total e completa elaboração dos Planos de Gerenciamento de Resíduos Sólidos (PGRS) no âmbito das unidades operacionais sob responsabilidade da Concessionária Águas do Rio, no Estado do Rio de Janeiro, priorizando as unidades efetivamente geradoras de resíduos. Diferentemente do contrato anterior — no qual os PGRS foram elaborados de maneira agregada, contemplando grupos de municípios e seus ativos correspondentes —, o presente escopo adota PGRS individualizados para as unidades de maior geração e PGRS agrupados — por superintendência regional, bloco contratual e proximidade — para as demais unidades (geradoras de menor porte e não geradoras). A proposta integrará o respectivo Contrato como anexo, constituindo compromisso de execução integral do serviço.</w:t>
       </w:r>
     </w:p>
     <w:p>
@@ -5749,7 +5749,7 @@
           <w:sz w:val="20"/>
           <w:szCs w:val="20"/>
         </w:rPr>
-        <w:t>Tabela 4 – PGRS individualizados (18 planos, cobrindo 19 unidades de maior geração, a partir de 500 t/ano de referência).</w:t>
+        <w:t>Tabela 4 – PGRS individualizados (18 planos, cobrindo 19 unidades de maior geração, a partir de 500 t/ano de referência; o plano da Base Operacional Penha abrange as unidades Penha I e II).</w:t>
       </w:r>
     </w:p>
     <w:tbl>
@@ -6028,7 +6028,7 @@
           </w:tcPr>
           <w:p>
             <w:r>
-              <w:t>Base Operacional Penha</w:t>
+              <w:t>Base Operacional Penha (Penha I e II)</w:t>
             </w:r>
           </w:p>
         </w:tc>
@@ -6080,7 +6080,7 @@
           </w:tcPr>
           <w:p>
             <w:r>
-              <w:t>Base Operacional Penha</w:t>
+              <w:t>Base Operacional Tijuca</w:t>
             </w:r>
           </w:p>
         </w:tc>
@@ -6132,7 +6132,7 @@
           </w:tcPr>
           <w:p>
             <w:r>
-              <w:t>Base Operacional Tijuca</w:t>
+              <w:t>Base Operacional Botafogo</w:t>
             </w:r>
           </w:p>
         </w:tc>
@@ -6152,7 +6152,7 @@
           </w:tcPr>
           <w:p>
             <w:r>
-              <w:t>4</w:t>
+              <w:t>1</w:t>
             </w:r>
           </w:p>
         </w:tc>
@@ -6184,7 +6184,7 @@
           </w:tcPr>
           <w:p>
             <w:r>
-              <w:t>Base Operacional Botafogo</w:t>
+              <w:t>ETE Pavuna</w:t>
             </w:r>
           </w:p>
         </w:tc>
@@ -6204,7 +6204,7 @@
           </w:tcPr>
           <w:p>
             <w:r>
-              <w:t>1</w:t>
+              <w:t>4</w:t>
             </w:r>
           </w:p>
         </w:tc>
@@ -6236,7 +6236,7 @@
           </w:tcPr>
           <w:p>
             <w:r>
-              <w:t>ETE Pavuna</w:t>
+              <w:t>ETE Pavuna Valo Oxidação</w:t>
             </w:r>
           </w:p>
         </w:tc>
@@ -6288,7 +6288,7 @@
           </w:tcPr>
           <w:p>
             <w:r>
-              <w:t>ETE Pavuna Valo Oxidação</w:t>
+              <w:t>Laboratório ETE Pavuna</w:t>
             </w:r>
           </w:p>
         </w:tc>
@@ -6340,7 +6340,7 @@
           </w:tcPr>
           <w:p>
             <w:r>
-              <w:t>Laboratório ETE Pavuna</w:t>
+              <w:t>Base Operacional Gávea</w:t>
             </w:r>
           </w:p>
         </w:tc>
@@ -6360,7 +6360,7 @@
           </w:tcPr>
           <w:p>
             <w:r>
-              <w:t>4</w:t>
+              <w:t>1</w:t>
             </w:r>
           </w:p>
         </w:tc>
@@ -6392,7 +6392,7 @@
           </w:tcPr>
           <w:p>
             <w:r>
-              <w:t>Base Operacional Gávea</w:t>
+              <w:t>Sede Nilopolis</w:t>
             </w:r>
           </w:p>
         </w:tc>
@@ -6402,7 +6402,7 @@
           </w:tcPr>
           <w:p>
             <w:r>
-              <w:t>Rio de Janeiro</w:t>
+              <w:t>Nilópolis</w:t>
             </w:r>
           </w:p>
         </w:tc>
@@ -6412,7 +6412,7 @@
           </w:tcPr>
           <w:p>
             <w:r>
-              <w:t>1</w:t>
+              <w:t>4</w:t>
             </w:r>
           </w:p>
         </w:tc>
@@ -6444,7 +6444,7 @@
           </w:tcPr>
           <w:p>
             <w:r>
-              <w:t>Sede Nilopolis</w:t>
+              <w:t>ETE Ilha Do Governador</w:t>
             </w:r>
           </w:p>
         </w:tc>
@@ -6454,7 +6454,7 @@
           </w:tcPr>
           <w:p>
             <w:r>
-              <w:t>Nilópolis</w:t>
+              <w:t>Rio de Janeiro</w:t>
             </w:r>
           </w:p>
         </w:tc>
@@ -6496,7 +6496,7 @@
           </w:tcPr>
           <w:p>
             <w:r>
-              <w:t>ETE Ilha do Governador</w:t>
+              <w:t>Base Operacional Méier</w:t>
             </w:r>
           </w:p>
         </w:tc>
@@ -6548,7 +6548,7 @@
           </w:tcPr>
           <w:p>
             <w:r>
-              <w:t>Base Operacional Méier</w:t>
+              <w:t>Base Operacional Campinho</w:t>
             </w:r>
           </w:p>
         </w:tc>
@@ -6600,7 +6600,7 @@
           </w:tcPr>
           <w:p>
             <w:r>
-              <w:t>Base Operacional Campinho</w:t>
+              <w:t>Base Operacional São Gonçalo</w:t>
             </w:r>
           </w:p>
         </w:tc>
@@ -6610,7 +6610,7 @@
           </w:tcPr>
           <w:p>
             <w:r>
-              <w:t>Rio de Janeiro</w:t>
+              <w:t>São Gonçalo</w:t>
             </w:r>
           </w:p>
         </w:tc>
@@ -6620,7 +6620,7 @@
           </w:tcPr>
           <w:p>
             <w:r>
-              <w:t>4</w:t>
+              <w:t>1</w:t>
             </w:r>
           </w:p>
         </w:tc>
@@ -6652,7 +6652,7 @@
           </w:tcPr>
           <w:p>
             <w:r>
-              <w:t>Base Operacional São Gonçalo</w:t>
+              <w:t>Reservatorio Vilar Dos Teles</w:t>
             </w:r>
           </w:p>
         </w:tc>
@@ -6662,7 +6662,7 @@
           </w:tcPr>
           <w:p>
             <w:r>
-              <w:t>São Gonçalo</w:t>
+              <w:t>São João de Meriti</w:t>
             </w:r>
           </w:p>
         </w:tc>
@@ -6672,7 +6672,7 @@
           </w:tcPr>
           <w:p>
             <w:r>
-              <w:t>1</w:t>
+              <w:t>4</w:t>
             </w:r>
           </w:p>
         </w:tc>
@@ -6704,7 +6704,7 @@
           </w:tcPr>
           <w:p>
             <w:r>
-              <w:t>Reservatorio Vilar dos Teles</w:t>
+              <w:t>ETE Penha</w:t>
             </w:r>
           </w:p>
         </w:tc>
@@ -6714,7 +6714,7 @@
           </w:tcPr>
           <w:p>
             <w:r>
-              <w:t>São João de Meriti</w:t>
+              <w:t>Rio de Janeiro</w:t>
             </w:r>
           </w:p>
         </w:tc>
@@ -6756,7 +6756,7 @@
           </w:tcPr>
           <w:p>
             <w:r>
-              <w:t>ETE Penha</w:t>
+              <w:t>EEE André Azevedo</w:t>
             </w:r>
           </w:p>
         </w:tc>
@@ -6776,7 +6776,7 @@
           </w:tcPr>
           <w:p>
             <w:r>
-              <w:t>4</w:t>
+              <w:t>1</w:t>
             </w:r>
           </w:p>
         </w:tc>
@@ -6808,59 +6808,7 @@
           </w:tcPr>
           <w:p>
             <w:r>
-              <w:t>EEE André Azevedo</w:t>
-            </w:r>
-          </w:p>
-        </w:tc>
-        <w:tc>
-          <w:tcPr>
-            <w:tcW w:type="dxa" w:w="2260"/>
-          </w:tcPr>
-          <w:p>
-            <w:r>
-              <w:t>Rio de Janeiro</w:t>
-            </w:r>
-          </w:p>
-        </w:tc>
-        <w:tc>
-          <w:tcPr>
-            <w:tcW w:type="dxa" w:w="800"/>
-          </w:tcPr>
-          <w:p>
-            <w:r>
-              <w:t>1</w:t>
-            </w:r>
-          </w:p>
-        </w:tc>
-        <w:tc>
-          <w:tcPr>
-            <w:tcW w:type="dxa" w:w="2460"/>
-          </w:tcPr>
-          <w:p>
-            <w:r>
-              <w:t>Maior geração (≥ 500 t/ano)</w:t>
-            </w:r>
-          </w:p>
-        </w:tc>
-      </w:tr>
-      <w:tr>
-        <w:tc>
-          <w:tcPr>
-            <w:tcW w:type="dxa" w:w="520"/>
-          </w:tcPr>
-          <w:p>
-            <w:r>
-              <w:t>19</w:t>
-            </w:r>
-          </w:p>
-        </w:tc>
-        <w:tc>
-          <w:tcPr>
-            <w:tcW w:type="dxa" w:w="3494"/>
-          </w:tcPr>
-          <w:p>
-            <w:r>
-              <w:t>Base Operacional Engenho de Dentro</w:t>
+              <w:t>Base Operacional Engenho De Dentro</w:t>
             </w:r>
           </w:p>
         </w:tc>
@@ -8565,7 +8513,7 @@
           <w:sz w:val="24"/>
           <w:szCs w:val="24"/>
         </w:rPr>
-        <w:t xml:space="preserve">Deverá ser previsto programa de treinamento/capacitação, realizado presencialmente, com abrangência de, no mínimo, 1 (um) treinamento por município contemplado pelas unidades priorizadas (19 municípios), sendo, para o município do Rio de Janeiro, no mínimo 5 (cinco) treinamentos. A CONTRATADA deverá entregar cronograma com proposta de datas, conteúdos, município e público-alvo, em comum acordo com a CONTRATANTE.</w:t>
+        <w:t>Deverá ser previsto programa de treinamento/capacitação, realizado presencialmente, com abrangência de, no mínimo, 1 (um) treinamento por município contemplado por unidades geradoras (22 municípios), sendo, para o município do Rio de Janeiro, no mínimo 5 (cinco) treinamentos. A CONTRATADA deverá entregar cronograma com proposta de datas, conteúdos, município e público-alvo, em comum acordo com a CONTRATANTE.</w:t>
       </w:r>
     </w:p>
     <w:p>

</xml_diff>